<commit_message>
Publish the public-safety catalogues
huggingface.co/datasets/Yuyongkim/inconvenience-public-safety — 12,414
records, 9,603,528 braille cells, one config per domain rather than one
merged file, because a reader who wants the pesticide rows should not have to
filter to find them.

The drafts and the cover letter name the dataset now, so the data-availability
statement points at something a reviewer can open rather than at instructions
for rebuilding it.

Also fixes a hardcoded article type in the submission builder. It said "Brief
Report" for every paper, which was right for the first in the series and wrong
for this one; it now reads the type from the cover letter, so the two cannot
disagree. Rebuilt all four packages: paper 2 is an Original Article, the rest
stay Brief Reports.
</commit_message>
<xml_diff>
--- a/paper2/submission/cover_letter.docx
+++ b/paper2/submission/cover_letter.docx
@@ -336,22 +336,32 @@
         <w:t>Reproducibility, including two things that cost me time.</w:t>
       </w:r>
       <w:r>
-        <w:t xml:space="preserve"> All three fetchers,</w:t>
+        <w:t xml:space="preserve"> The braille dataset</w:t>
       </w:r>
     </w:p>
     <w:p>
       <w:r>
-        <w:t>the adapters, the validation harness and every figure script are released; the</w:t>
+        <w:t>is published at huggingface.co/datasets/Yuyongkim/inconvenience-public-safety,</w:t>
       </w:r>
     </w:p>
     <w:p>
       <w:r>
-        <w:t>collected source text is not redistributed, since all three registers are public</w:t>
+        <w:t>one config per domain. All three fetchers, the adapters, the validation harness</w:t>
       </w:r>
     </w:p>
     <w:p>
       <w:r>
-        <w:t>APIs a reader can call with their own key. Section 3.3 records two obstacles</w:t>
+        <w:t>and every figure script are released; the collected source text is not</w:t>
+      </w:r>
+    </w:p>
+    <w:p>
+      <w:r>
+        <w:t>redistributed, since all three registers are public APIs a reader can call with</w:t>
+      </w:r>
+    </w:p>
+    <w:p>
+      <w:r>
+        <w:t>their own key. Section 3.3 records two obstacles</w:t>
       </w:r>
     </w:p>
     <w:p>

</xml_diff>